<commit_message>
7a moduli mustaqil: lib/utils.php’siz ham ishlaydi (XAMPP)
XAMPP’da faqat 7a papkasi ko‘chirilganda lib/utils.php topilmay
«Failed opening required» xatosi chiqardi. Endi modul o‘zi yetarli:
- JazbaAI’ning lib/utils.php fayli bo‘lsa ulanadi, bo‘lmasa shart emas
- savollar modul ichida: public/7a/_savollar/*.json.php (build.py yasaydi)
- javoblar modul ichida: public/7a/_data/ (gitignore, .htaccess + .json.php himoya)
- ustoz paneliga o‘z paroli bilan kirish (birinchi ochilganda o‘rnatiladi);
  JazbaAI ichida SINF7A_USTOZ logini bilan kirish ham saqlandi
- vaqt Asia/Tashkent bo‘yicha yoziladi
- README: XAMPP’ga o‘rnatish va manzilni topish bo‘yicha qadamlar

Co-Authored-By: Claude Opus 5.5 <noreply@anthropic.com>
Claude-Session: https://claude.ai/code/session_01YZdDMcwhkN45KiyvEt8Tzn
</commit_message>
<xml_diff>
--- a/7A-diagnostika/chop_etish/7A_toliq_qollanma.docx
+++ b/7A-diagnostika/chop_etish/7A_toliq_qollanma.docx
@@ -1346,7 +1346,7 @@
         <w:t xml:space="preserve"> </w:t>
       </w:r>
       <w:r>
-        <w:t xml:space="preserve">(pastda).</w:t>
+        <w:t xml:space="preserve">— mustaqil papka (pastda).</w:t>
       </w:r>
     </w:p>
     <w:p>
@@ -1371,7 +1371,7 @@
         <w:pStyle w:val="FirstParagraph"/>
       </w:pPr>
       <w:r>
-        <w:t xml:space="preserve">Saytingizga (JazbaAI)</w:t>
+        <w:t xml:space="preserve">Onlayn qism — bitta mustaqil</w:t>
       </w:r>
       <w:r>
         <w:t xml:space="preserve"> </w:t>
@@ -1382,13 +1382,50 @@
           <w:bCs/>
           <w:b/>
         </w:rPr>
-        <w:t xml:space="preserve">/7a/</w:t>
-      </w:r>
-      <w:r>
-        <w:t xml:space="preserve"> </w:t>
-      </w:r>
-      <w:r>
-        <w:t xml:space="preserve">bo‘limi qo‘shildi. O‘quvchilar kompyuter yoki telefondan kiradi, javoblar serverga saqlanadi, natijalar o‘zi hisoblanadi.</w:t>
+        <w:t xml:space="preserve">7a</w:t>
+      </w:r>
+      <w:r>
+        <w:t xml:space="preserve"> </w:t>
+      </w:r>
+      <w:r>
+        <w:t xml:space="preserve">papkasi (</w:t>
+      </w:r>
+      <w:r>
+        <w:rPr>
+          <w:rStyle w:val="VerbatimChar"/>
+        </w:rPr>
+        <w:t xml:space="preserve">public/7a/</w:t>
+      </w:r>
+      <w:r>
+        <w:t xml:space="preserve">). U boshqa fayllarga bog‘liq emas:</w:t>
+      </w:r>
+      <w:r>
+        <w:t xml:space="preserve"> </w:t>
+      </w:r>
+      <w:r>
+        <w:t xml:space="preserve">PHP ishlaydigan istalgan joyga (XAMPP, maktab sayti, JazbaAI) papkani</w:t>
+      </w:r>
+      <w:r>
+        <w:t xml:space="preserve"> </w:t>
+      </w:r>
+      <w:r>
+        <w:rPr>
+          <w:bCs/>
+          <w:b/>
+        </w:rPr>
+        <w:t xml:space="preserve">to‘liq</w:t>
+      </w:r>
+      <w:r>
+        <w:t xml:space="preserve"> </w:t>
+      </w:r>
+      <w:r>
+        <w:t xml:space="preserve">ko‘chirsangiz ishlaydi.</w:t>
+      </w:r>
+      <w:r>
+        <w:t xml:space="preserve"> </w:t>
+      </w:r>
+      <w:r>
+        <w:t xml:space="preserve">O‘quvchilar kompyuter yoki telefondan kiradi, javoblar serverga saqlanadi, natijalar o‘zi hisoblanadi.</w:t>
       </w:r>
     </w:p>
     <w:tbl>
@@ -1427,7 +1464,7 @@
               <w:jc w:val="left"/>
             </w:pPr>
             <w:r>
-              <w:t xml:space="preserve">Manzil</w:t>
+              <w:t xml:space="preserve">Manzil (misol)</w:t>
             </w:r>
           </w:p>
         </w:tc>
@@ -1468,7 +1505,7 @@
               <w:rPr>
                 <w:rStyle w:val="VerbatimChar"/>
               </w:rPr>
-              <w:t xml:space="preserve">https://cloud.com.uz/7a/</w:t>
+              <w:t xml:space="preserve">…/7a/</w:t>
             </w:r>
           </w:p>
         </w:tc>
@@ -1509,35 +1546,19 @@
               <w:rPr>
                 <w:rStyle w:val="VerbatimChar"/>
               </w:rPr>
-              <w:t xml:space="preserve">https://cloud.com.uz/7a/admin.php</w:t>
-            </w:r>
-          </w:p>
-        </w:tc>
-        <w:tc>
-          <w:tcPr/>
-          <w:p>
-            <w:pPr>
-              <w:pStyle w:val="Compact"/>
-              <w:jc w:val="left"/>
-            </w:pPr>
-            <w:r>
-              <w:t xml:space="preserve">JazbaAI’ga</w:t>
-            </w:r>
-            <w:r>
-              <w:t xml:space="preserve"> </w:t>
-            </w:r>
-            <w:r>
-              <w:rPr>
-                <w:bCs/>
-                <w:b/>
-              </w:rPr>
-              <w:t xml:space="preserve">Begdulla</w:t>
-            </w:r>
-            <w:r>
-              <w:t xml:space="preserve"> </w:t>
-            </w:r>
-            <w:r>
-              <w:t xml:space="preserve">login bilan kirgan bo‘lsangiz ochiladi: sozlamalar, natijalar, o‘quvchi kartasi, CSV yuklab olish</w:t>
+              <w:t xml:space="preserve">…/7a/admin.php</w:t>
+            </w:r>
+          </w:p>
+        </w:tc>
+        <w:tc>
+          <w:tcPr/>
+          <w:p>
+            <w:pPr>
+              <w:pStyle w:val="Compact"/>
+              <w:jc w:val="left"/>
+            </w:pPr>
+            <w:r>
+              <w:t xml:space="preserve">Parol bilan kiradi: sozlamalar, natijalar, o‘quvchi kartasi, CSV yuklab olish</w:t>
             </w:r>
           </w:p>
         </w:tc>
@@ -1552,6 +1573,144 @@
           <w:bCs/>
           <w:b/>
         </w:rPr>
+        <w:t xml:space="preserve">Manzil papka qayerda turganiga bog‘liq.</w:t>
+      </w:r>
+      <w:r>
+        <w:t xml:space="preserve"> </w:t>
+      </w:r>
+      <w:r>
+        <w:t xml:space="preserve">Masalan, XAMPP’da:</w:t>
+      </w:r>
+      <w:r>
+        <w:t xml:space="preserve"> </w:t>
+      </w:r>
+      <w:r>
+        <w:rPr>
+          <w:rStyle w:val="VerbatimChar"/>
+        </w:rPr>
+        <w:t xml:space="preserve">C:\xampp\htdocs\7a\</w:t>
+      </w:r>
+      <w:r>
+        <w:t xml:space="preserve"> </w:t>
+      </w:r>
+      <w:r>
+        <w:t xml:space="preserve">→</w:t>
+      </w:r>
+      <w:r>
+        <w:t xml:space="preserve"> </w:t>
+      </w:r>
+      <w:r>
+        <w:rPr>
+          <w:rStyle w:val="VerbatimChar"/>
+        </w:rPr>
+        <w:t xml:space="preserve">http://localhost/7a/</w:t>
+      </w:r>
+      <w:r>
+        <w:t xml:space="preserve">;</w:t>
+      </w:r>
+      <w:r>
+        <w:t xml:space="preserve"> </w:t>
+      </w:r>
+      <w:r>
+        <w:t xml:space="preserve">sayt papkasi</w:t>
+      </w:r>
+      <w:r>
+        <w:t xml:space="preserve"> </w:t>
+      </w:r>
+      <w:r>
+        <w:rPr>
+          <w:rStyle w:val="VerbatimChar"/>
+        </w:rPr>
+        <w:t xml:space="preserve">E:\Xojeli 5-mektep\</w:t>
+      </w:r>
+      <w:r>
+        <w:t xml:space="preserve"> </w:t>
+      </w:r>
+      <w:r>
+        <w:t xml:space="preserve">bo‘lsa va</w:t>
+      </w:r>
+      <w:r>
+        <w:t xml:space="preserve"> </w:t>
+      </w:r>
+      <w:r>
+        <w:rPr>
+          <w:rStyle w:val="VerbatimChar"/>
+        </w:rPr>
+        <w:t xml:space="preserve">7a</w:t>
+      </w:r>
+      <w:r>
+        <w:t xml:space="preserve"> </w:t>
+      </w:r>
+      <w:r>
+        <w:t xml:space="preserve">uning</w:t>
+      </w:r>
+      <w:r>
+        <w:t xml:space="preserve"> </w:t>
+      </w:r>
+      <w:r>
+        <w:rPr>
+          <w:rStyle w:val="VerbatimChar"/>
+        </w:rPr>
+        <w:t xml:space="preserve">public</w:t>
+      </w:r>
+      <w:r>
+        <w:t xml:space="preserve"> </w:t>
+      </w:r>
+      <w:r>
+        <w:t xml:space="preserve">ichida bo‘lsa →</w:t>
+      </w:r>
+      <w:r>
+        <w:t xml:space="preserve"> </w:t>
+      </w:r>
+      <w:r>
+        <w:rPr>
+          <w:rStyle w:val="VerbatimChar"/>
+        </w:rPr>
+        <w:t xml:space="preserve">http://localhost/public/7a/</w:t>
+      </w:r>
+      <w:r>
+        <w:t xml:space="preserve"> </w:t>
+      </w:r>
+      <w:r>
+        <w:t xml:space="preserve">(Apache’da qaysi papka sayt ildizi qilib sozlanganiga qarab). Sinfdagi boshqa kompyuterlardan kirish uchun</w:t>
+      </w:r>
+      <w:r>
+        <w:t xml:space="preserve"> </w:t>
+      </w:r>
+      <w:r>
+        <w:rPr>
+          <w:rStyle w:val="VerbatimChar"/>
+        </w:rPr>
+        <w:t xml:space="preserve">localhost</w:t>
+      </w:r>
+      <w:r>
+        <w:t xml:space="preserve"> </w:t>
+      </w:r>
+      <w:r>
+        <w:t xml:space="preserve">o‘rniga ustoz kompyuterining IP manzilini yozing (masalan</w:t>
+      </w:r>
+      <w:r>
+        <w:t xml:space="preserve"> </w:t>
+      </w:r>
+      <w:r>
+        <w:rPr>
+          <w:rStyle w:val="VerbatimChar"/>
+        </w:rPr>
+        <w:t xml:space="preserve">http://192.168.1.10/7a/</w:t>
+      </w:r>
+      <w:r>
+        <w:t xml:space="preserve">).</w:t>
+      </w:r>
+    </w:p>
+    <w:p>
+      <w:pPr>
+        <w:pStyle w:val="BodyText"/>
+      </w:pPr>
+      <w:r>
+        <w:rPr>
+          <w:bCs/>
+          <w:b/>
+        </w:rPr>
         <w:t xml:space="preserve">Birinchi sozlash (5 daqiqa):</w:t>
       </w:r>
     </w:p>
@@ -1564,52 +1723,81 @@
         <w:pStyle w:val="Compact"/>
       </w:pPr>
       <w:r>
-        <w:t xml:space="preserve">Serverda</w:t>
-      </w:r>
-      <w:r>
-        <w:t xml:space="preserve"> </w:t>
-      </w:r>
-      <w:r>
         <w:rPr>
           <w:rStyle w:val="VerbatimChar"/>
         </w:rPr>
-        <w:t xml:space="preserve">git pull</w:t>
-      </w:r>
-      <w:r>
-        <w:t xml:space="preserve"> </w:t>
-      </w:r>
-      <w:r>
-        <w:t xml:space="preserve">qiling (yoki</w:t>
-      </w:r>
-      <w:r>
-        <w:t xml:space="preserve"> </w:t>
+        <w:t xml:space="preserve">7a</w:t>
+      </w:r>
+      <w:r>
+        <w:t xml:space="preserve"> </w:t>
+      </w:r>
+      <w:r>
+        <w:t xml:space="preserve">papkasini</w:t>
+      </w:r>
+      <w:r>
+        <w:t xml:space="preserve"> </w:t>
+      </w:r>
+      <w:r>
+        <w:rPr>
+          <w:bCs/>
+          <w:b/>
+        </w:rPr>
+        <w:t xml:space="preserve">ichidagi hamma narsa bilan</w:t>
+      </w:r>
+      <w:r>
+        <w:t xml:space="preserve"> </w:t>
+      </w:r>
+      <w:r>
+        <w:t xml:space="preserve">(</w:t>
       </w:r>
       <w:r>
         <w:rPr>
           <w:rStyle w:val="VerbatimChar"/>
         </w:rPr>
-        <w:t xml:space="preserve">public/7a/</w:t>
-      </w:r>
-      <w:r>
-        <w:t xml:space="preserve"> </w:t>
-      </w:r>
-      <w:r>
-        <w:t xml:space="preserve">va</w:t>
-      </w:r>
-      <w:r>
-        <w:t xml:space="preserve"> </w:t>
-      </w:r>
+        <w:t xml:space="preserve">_savollar</w:t>
+      </w:r>
+      <w:r>
+        <w:t xml:space="preserve"> </w:t>
+      </w:r>
+      <w:r>
+        <w:t xml:space="preserve">papkasi ham!) saytingizga ko‘chiring.</w:t>
+      </w:r>
+    </w:p>
+    <w:p>
+      <w:pPr>
+        <w:numPr>
+          <w:ilvl w:val="0"/>
+          <w:numId w:val="1001"/>
+        </w:numPr>
+        <w:pStyle w:val="Compact"/>
+      </w:pPr>
       <w:r>
         <w:rPr>
           <w:rStyle w:val="VerbatimChar"/>
         </w:rPr>
-        <w:t xml:space="preserve">7A-diagnostika/savollar/</w:t>
-      </w:r>
-      <w:r>
-        <w:t xml:space="preserve"> </w:t>
-      </w:r>
-      <w:r>
-        <w:t xml:space="preserve">papkalarini serverga ko‘chiring).</w:t>
+        <w:t xml:space="preserve">…/7a/admin.php</w:t>
+      </w:r>
+      <w:r>
+        <w:t xml:space="preserve"> </w:t>
+      </w:r>
+      <w:r>
+        <w:t xml:space="preserve">ni oching → birinchi marta</w:t>
+      </w:r>
+      <w:r>
+        <w:t xml:space="preserve"> </w:t>
+      </w:r>
+      <w:r>
+        <w:rPr>
+          <w:bCs/>
+          <w:b/>
+        </w:rPr>
+        <w:t xml:space="preserve">ustoz parolini o‘rnating</w:t>
+      </w:r>
+      <w:r>
+        <w:t xml:space="preserve"> </w:t>
+      </w:r>
+      <w:r>
+        <w:t xml:space="preserve">(kamida 6 belgi). Buni o‘quvchilar kirishidan oldin qiling.</w:t>
       </w:r>
     </w:p>
     <w:p>
@@ -1621,7 +1809,17 @@
         <w:pStyle w:val="Compact"/>
       </w:pPr>
       <w:r>
-        <w:t xml:space="preserve">JazbaAI’ga ustoz sifatida kiring →</w:t>
+        <w:rPr>
+          <w:bCs/>
+          <w:b/>
+        </w:rPr>
+        <w:t xml:space="preserve">Sozlamalar</w:t>
+      </w:r>
+      <w:r>
+        <w:t xml:space="preserve"> </w:t>
+      </w:r>
+      <w:r>
+        <w:t xml:space="preserve">bo‘limida: sinf kodini yozing (masalan</w:t>
       </w:r>
       <w:r>
         <w:t xml:space="preserve"> </w:t>
@@ -1630,13 +1828,29 @@
         <w:rPr>
           <w:rStyle w:val="VerbatimChar"/>
         </w:rPr>
-        <w:t xml:space="preserve">…/7a/admin.php</w:t>
-      </w:r>
-      <w:r>
-        <w:t xml:space="preserve"> </w:t>
-      </w:r>
-      <w:r>
-        <w:t xml:space="preserve">ni oching.</w:t>
+        <w:t xml:space="preserve">7A2026</w:t>
+      </w:r>
+      <w:r>
+        <w:t xml:space="preserve">), o‘quvchilar ro‘yxatini (har qatorda bitta F.I.) joylang,</w:t>
+      </w:r>
+      <w:r>
+        <w:t xml:space="preserve"> </w:t>
+      </w:r>
+      <w:r>
+        <w:t xml:space="preserve">«Tanishuv so‘rovnomasi» va «Kirish testi (A)» ni yoqing →</w:t>
+      </w:r>
+      <w:r>
+        <w:t xml:space="preserve"> </w:t>
+      </w:r>
+      <w:r>
+        <w:rPr>
+          <w:bCs/>
+          <w:b/>
+        </w:rPr>
+        <w:t xml:space="preserve">Saqlash</w:t>
+      </w:r>
+      <w:r>
+        <w:t xml:space="preserve">.</w:t>
       </w:r>
     </w:p>
     <w:p>
@@ -1648,17 +1862,27 @@
         <w:pStyle w:val="Compact"/>
       </w:pPr>
       <w:r>
-        <w:rPr>
-          <w:bCs/>
-          <w:b/>
-        </w:rPr>
-        <w:t xml:space="preserve">Sozlamalar</w:t>
-      </w:r>
-      <w:r>
-        <w:t xml:space="preserve"> </w:t>
-      </w:r>
-      <w:r>
-        <w:t xml:space="preserve">bo‘limida: sinf kodini yozing (masalan</w:t>
+        <w:t xml:space="preserve">O‘zingiz bir marta o‘quvchi sifatida kirib sinab ko‘ring, keyin admin’da o‘sha yozuvni o‘chiring.</w:t>
+      </w:r>
+    </w:p>
+    <w:p>
+      <w:pPr>
+        <w:numPr>
+          <w:ilvl w:val="0"/>
+          <w:numId w:val="1001"/>
+        </w:numPr>
+        <w:pStyle w:val="Compact"/>
+      </w:pPr>
+      <w:r>
+        <w:t xml:space="preserve">Yanvarda «Kirish testi»ni o‘chirib, «Yakuniy test (B)» va «Fikr so‘rovnomasi»ni yoqasiz.</w:t>
+      </w:r>
+    </w:p>
+    <w:p>
+      <w:pPr>
+        <w:pStyle w:val="BlockText"/>
+      </w:pPr>
+      <w:r>
+        <w:t xml:space="preserve">O‘quvchi javoblari</w:t>
       </w:r>
       <w:r>
         <w:t xml:space="preserve"> </w:t>
@@ -1667,70 +1891,96 @@
         <w:rPr>
           <w:rStyle w:val="VerbatimChar"/>
         </w:rPr>
-        <w:t xml:space="preserve">7A2026</w:t>
-      </w:r>
-      <w:r>
-        <w:t xml:space="preserve">), o‘quvchilar ro‘yxatini (har qatorda bitta F.I.) joylang, «Tanishuv so‘rovnomasi» va «Kirish testi (A)» ni yoqing →</w:t>
-      </w:r>
-      <w:r>
-        <w:t xml:space="preserve"> </w:t>
-      </w:r>
-      <w:r>
-        <w:rPr>
-          <w:bCs/>
-          <w:b/>
-        </w:rPr>
-        <w:t xml:space="preserve">Saqlash</w:t>
-      </w:r>
-      <w:r>
-        <w:t xml:space="preserve">.</w:t>
-      </w:r>
-    </w:p>
-    <w:p>
-      <w:pPr>
-        <w:numPr>
-          <w:ilvl w:val="0"/>
-          <w:numId w:val="1001"/>
-        </w:numPr>
-        <w:pStyle w:val="Compact"/>
-      </w:pPr>
-      <w:r>
-        <w:t xml:space="preserve">O‘zingiz bir marta o‘quvchi sifatida kirib sinab ko‘ring, keyin admin’da o‘sha yozuvni o‘chiring.</w:t>
-      </w:r>
-    </w:p>
-    <w:p>
-      <w:pPr>
-        <w:numPr>
-          <w:ilvl w:val="0"/>
-          <w:numId w:val="1001"/>
-        </w:numPr>
-        <w:pStyle w:val="Compact"/>
-      </w:pPr>
-      <w:r>
-        <w:t xml:space="preserve">Yanvarda «Kirish testi»ni o‘chirib, «Yakuniy test (B)» va «Fikr so‘rovnomasi»ni yoqasiz.</w:t>
-      </w:r>
-    </w:p>
-    <w:p>
-      <w:pPr>
-        <w:pStyle w:val="BlockText"/>
-      </w:pPr>
-      <w:r>
-        <w:t xml:space="preserve">Admin’ga boshqa login bilan kirish kerak bo‘lsa,</w:t>
-      </w:r>
-      <w:r>
-        <w:t xml:space="preserve"> </w:t>
+        <w:t xml:space="preserve">7a/_data/</w:t>
+      </w:r>
+      <w:r>
+        <w:t xml:space="preserve"> </w:t>
+      </w:r>
+      <w:r>
+        <w:t xml:space="preserve">papkasida saqlanadi (birinchi javobda o‘zi yaratiladi) va</w:t>
+      </w:r>
+      <w:r>
+        <w:t xml:space="preserve"> </w:t>
+      </w:r>
+      <w:r>
+        <w:rPr>
+          <w:bCs/>
+          <w:b/>
+        </w:rPr>
+        <w:t xml:space="preserve">GitHub’ga yuklanmaydi</w:t>
+      </w:r>
+      <w:r>
+        <w:t xml:space="preserve"> </w:t>
+      </w:r>
+      <w:r>
+        <w:t xml:space="preserve">(</w:t>
       </w:r>
       <w:r>
         <w:rPr>
           <w:rStyle w:val="VerbatimChar"/>
         </w:rPr>
+        <w:t xml:space="preserve">.gitignore</w:t>
+      </w:r>
+      <w:r>
+        <w:t xml:space="preserve">).</w:t>
+      </w:r>
+      <w:r>
+        <w:t xml:space="preserve"> </w:t>
+      </w:r>
+      <w:r>
+        <w:t xml:space="preserve">Zaxira nusxa uchun shu papkani ko‘chirib qo‘ying. Parolni unutsangiz —</w:t>
+      </w:r>
+      <w:r>
+        <w:t xml:space="preserve"> </w:t>
+      </w:r>
+      <w:r>
+        <w:rPr>
+          <w:rStyle w:val="VerbatimChar"/>
+        </w:rPr>
+        <w:t xml:space="preserve">7a/_data/ustoz.json.php</w:t>
+      </w:r>
+      <w:r>
+        <w:t xml:space="preserve"> </w:t>
+      </w:r>
+      <w:r>
+        <w:t xml:space="preserve">faylini o‘chiring.</w:t>
+      </w:r>
+      <w:r>
+        <w:t xml:space="preserve"> </w:t>
+      </w:r>
+      <w:r>
+        <w:t xml:space="preserve">JazbaAI ichida ishlatsangiz, JazbaAI’dagi</w:t>
+      </w:r>
+      <w:r>
+        <w:t xml:space="preserve"> </w:t>
+      </w:r>
+      <w:r>
+        <w:rPr>
+          <w:bCs/>
+          <w:b/>
+        </w:rPr>
+        <w:t xml:space="preserve">Begdulla</w:t>
+      </w:r>
+      <w:r>
+        <w:t xml:space="preserve"> </w:t>
+      </w:r>
+      <w:r>
+        <w:t xml:space="preserve">logini bilan ham kirish mumkin (boshqa loginlar:</w:t>
+      </w:r>
+      <w:r>
+        <w:t xml:space="preserve"> </w:t>
+      </w:r>
+      <w:r>
+        <w:rPr>
+          <w:rStyle w:val="VerbatimChar"/>
+        </w:rPr>
         <w:t xml:space="preserve">.env</w:t>
       </w:r>
       <w:r>
         <w:t xml:space="preserve"> </w:t>
       </w:r>
       <w:r>
-        <w:t xml:space="preserve">fayliga</w:t>
+        <w:t xml:space="preserve">→</w:t>
       </w:r>
       <w:r>
         <w:t xml:space="preserve"> </w:t>
@@ -1740,55 +1990,6 @@
           <w:rStyle w:val="VerbatimChar"/>
         </w:rPr>
         <w:t xml:space="preserve">SINF7A_USTOZ=login1,login2</w:t>
-      </w:r>
-      <w:r>
-        <w:t xml:space="preserve"> </w:t>
-      </w:r>
-      <w:r>
-        <w:t xml:space="preserve">qatorini qo‘shing.</w:t>
-      </w:r>
-      <w:r>
-        <w:t xml:space="preserve"> </w:t>
-      </w:r>
-      <w:r>
-        <w:t xml:space="preserve">O‘quvchi javoblari</w:t>
-      </w:r>
-      <w:r>
-        <w:t xml:space="preserve"> </w:t>
-      </w:r>
-      <w:r>
-        <w:rPr>
-          <w:rStyle w:val="VerbatimChar"/>
-        </w:rPr>
-        <w:t xml:space="preserve">data/7a/</w:t>
-      </w:r>
-      <w:r>
-        <w:t xml:space="preserve"> </w:t>
-      </w:r>
-      <w:r>
-        <w:t xml:space="preserve">papkasida saqlanadi va</w:t>
-      </w:r>
-      <w:r>
-        <w:t xml:space="preserve"> </w:t>
-      </w:r>
-      <w:r>
-        <w:rPr>
-          <w:bCs/>
-          <w:b/>
-        </w:rPr>
-        <w:t xml:space="preserve">GitHub’ga yuklanmaydi</w:t>
-      </w:r>
-      <w:r>
-        <w:t xml:space="preserve"> </w:t>
-      </w:r>
-      <w:r>
-        <w:t xml:space="preserve">(</w:t>
-      </w:r>
-      <w:r>
-        <w:rPr>
-          <w:rStyle w:val="VerbatimChar"/>
-        </w:rPr>
-        <w:t xml:space="preserve">.gitignore</w:t>
       </w:r>
       <w:r>
         <w:t xml:space="preserve">).</w:t>
@@ -2525,13 +2726,13 @@
         <w:rPr>
           <w:rStyle w:val="VerbatimChar"/>
         </w:rPr>
-        <w:t xml:space="preserve">/7a/admin.php</w:t>
-      </w:r>
-      <w:r>
-        <w:t xml:space="preserve"> </w:t>
-      </w:r>
-      <w:r>
-        <w:t xml:space="preserve">→ sinf kodi, ro‘yxat, so‘rovnoma va A-testni yoqish → o‘zingiz bir marta sinab ko‘rish</w:t>
+        <w:t xml:space="preserve">…/7a/admin.php</w:t>
+      </w:r>
+      <w:r>
+        <w:t xml:space="preserve"> </w:t>
+      </w:r>
+      <w:r>
+        <w:t xml:space="preserve">→ ustoz parolini o‘rnatish → sinf kodi, ro‘yxat, so‘rovnoma va A-testni yoqish → o‘zingiz bir marta sinab ko‘rish</w:t>
       </w:r>
     </w:p>
     <w:p>

</xml_diff>

<commit_message>
7a: tez yozish hisobi tuzatildi, sinov javoblari haqida ogohlantirish
- Tez yozish endi matnni tekislab (LCS) solishtiradi: «o‘» o‘rniga «o'»
  yoki bitta tushib qolgan harf keyingi barcha belgilarni xato qilmaydi;
  tutuq belgilari, bo‘shliqlar va harf kattaligi normallashtiriladi.
  Saqlangan eski yozuvlar xom matndan avtomatik qayta hisoblanadi.
- Jonli dars sahifasida: dars boshlanmagan, lekin bazada javoblar bo‘lsa
  — arxivlash haqida ogohlantirish (sinov javoblari darsga aralashmasin)
- 13-qo‘llanma: sinashda haqiqiy o‘quvchi ismini tanlamaslik

Co-Authored-By: Claude Opus 5.5 <noreply@anthropic.com>
Claude-Session: https://claude.ai/code/session_01YZdDMcwhkN45KiyvEt8Tzn
</commit_message>
<xml_diff>
--- a/7A-diagnostika/chop_etish/7A_toliq_qollanma.docx
+++ b/7A-diagnostika/chop_etish/7A_toliq_qollanma.docx
@@ -39814,6 +39814,43 @@
       </w:r>
       <w:r>
         <w:t xml:space="preserve">ni oching (o‘quvchi sifatida), panelda «▶ Darsni boshlash», «Keyingi ▶» ni bir necha marta bosing.</w:t>
+      </w:r>
+      <w:r>
+        <w:t xml:space="preserve"> </w:t>
+      </w:r>
+      <w:r>
+        <w:t xml:space="preserve">⚠️ Sinashda</w:t>
+      </w:r>
+      <w:r>
+        <w:t xml:space="preserve"> </w:t>
+      </w:r>
+      <w:r>
+        <w:rPr>
+          <w:bCs/>
+          <w:b/>
+        </w:rPr>
+        <w:t xml:space="preserve">haqiqiy o‘quvchi ismini tanlamang</w:t>
+      </w:r>
+      <w:r>
+        <w:t xml:space="preserve"> </w:t>
+      </w:r>
+      <w:r>
+        <w:t xml:space="preserve">— «Ro‘yxatda yo‘qman…» →</w:t>
+      </w:r>
+      <w:r>
+        <w:t xml:space="preserve"> </w:t>
+      </w:r>
+      <w:r>
+        <w:rPr>
+          <w:rStyle w:val="VerbatimChar"/>
+        </w:rPr>
+        <w:t xml:space="preserve">TEST Ustoz</w:t>
+      </w:r>
+      <w:r>
+        <w:t xml:space="preserve"> </w:t>
+      </w:r>
+      <w:r>
+        <w:t xml:space="preserve">deb yozing. Aks holda o‘sha o‘quvchi darsda ba’zi bosqichlarni «topshirilgan» deb ko‘radi.</w:t>
       </w:r>
     </w:p>
     <w:p>

</xml_diff>